<commit_message>
docs: merge Local vs Vercel comparison directly into FinalUpdate.docx and remove v2
</commit_message>
<xml_diff>
--- a/docs/QA_Reports/Laporan_Perjalanan_QA_HYDE_FinalUpdate.docx
+++ b/docs/QA_Reports/Laporan_Perjalanan_QA_HYDE_FinalUpdate.docx
@@ -1046,6 +1046,292 @@
         <w:t>[ MASUKKAN SCREENSHOT K6 DI SINI ]</w:t>
       </w:r>
     </w:p>
+    <w:p>
+      <w:pPr>
+        <w:pStyle w:val="Heading2"/>
+      </w:pPr>
+      <w:r>
+        <w:t>Perbandingan Lingkungan Lokal (Localhost) vs Produksi (Vercel)</w:t>
+      </w:r>
+    </w:p>
+    <w:p>
+      <w:r>
+        <w:t>Untuk memastikan bahwa performa aplikasi dipengaruhi oleh infrastruktur jaringan dan bukan oleh kode yang buruk (bottleneck di level kode), pengujian beban dilakukan di dua environment yang berbeda pada beban puncak (100 VU dan 150 VU).</w:t>
+      </w:r>
+    </w:p>
+    <w:tbl>
+      <w:tblPr>
+        <w:tblStyle w:val="TableGrid"/>
+        <w:tblW w:type="auto" w:w="0"/>
+        <w:tblLook w:firstColumn="1" w:firstRow="1" w:lastColumn="0" w:lastRow="0" w:noHBand="0" w:noVBand="1" w:val="04A0"/>
+      </w:tblPr>
+      <w:tblGrid>
+        <w:gridCol w:w="2160"/>
+        <w:gridCol w:w="2160"/>
+        <w:gridCol w:w="2160"/>
+        <w:gridCol w:w="2160"/>
+      </w:tblGrid>
+      <w:tr>
+        <w:tc>
+          <w:tcPr>
+            <w:tcW w:type="dxa" w:w="2160"/>
+          </w:tcPr>
+          <w:p>
+            <w:r>
+              <w:t>Skenario &amp; Lingkungan</w:t>
+            </w:r>
+          </w:p>
+        </w:tc>
+        <w:tc>
+          <w:tcPr>
+            <w:tcW w:type="dxa" w:w="2160"/>
+          </w:tcPr>
+          <w:p>
+            <w:r>
+              <w:t>Latensi P95 (Kecepatan)</w:t>
+            </w:r>
+          </w:p>
+        </w:tc>
+        <w:tc>
+          <w:tcPr>
+            <w:tcW w:type="dxa" w:w="2160"/>
+          </w:tcPr>
+          <w:p>
+            <w:r>
+              <w:t>Throughput (Request/Detik)</w:t>
+            </w:r>
+          </w:p>
+        </w:tc>
+        <w:tc>
+          <w:tcPr>
+            <w:tcW w:type="dxa" w:w="2160"/>
+          </w:tcPr>
+          <w:p>
+            <w:r>
+              <w:t>Error Rate</w:t>
+            </w:r>
+          </w:p>
+        </w:tc>
+      </w:tr>
+      <w:tr>
+        <w:tc>
+          <w:tcPr>
+            <w:tcW w:type="dxa" w:w="2160"/>
+          </w:tcPr>
+          <w:p>
+            <w:r>
+              <w:t>100 VU - Lokal (Laptop)</w:t>
+            </w:r>
+          </w:p>
+        </w:tc>
+        <w:tc>
+          <w:tcPr>
+            <w:tcW w:type="dxa" w:w="2160"/>
+          </w:tcPr>
+          <w:p>
+            <w:r>
+              <w:t>42.63 ms</w:t>
+            </w:r>
+          </w:p>
+        </w:tc>
+        <w:tc>
+          <w:tcPr>
+            <w:tcW w:type="dxa" w:w="2160"/>
+          </w:tcPr>
+          <w:p>
+            <w:r>
+              <w:t>36.37 req/s</w:t>
+            </w:r>
+          </w:p>
+        </w:tc>
+        <w:tc>
+          <w:tcPr>
+            <w:tcW w:type="dxa" w:w="2160"/>
+          </w:tcPr>
+          <w:p>
+            <w:r>
+              <w:t>0.00%</w:t>
+            </w:r>
+          </w:p>
+        </w:tc>
+      </w:tr>
+      <w:tr>
+        <w:tc>
+          <w:tcPr>
+            <w:tcW w:type="dxa" w:w="2160"/>
+          </w:tcPr>
+          <w:p>
+            <w:r>
+              <w:t>100 VU - Produksi (Vercel)</w:t>
+            </w:r>
+          </w:p>
+        </w:tc>
+        <w:tc>
+          <w:tcPr>
+            <w:tcW w:type="dxa" w:w="2160"/>
+          </w:tcPr>
+          <w:p>
+            <w:r>
+              <w:t>560.38 ms</w:t>
+            </w:r>
+          </w:p>
+        </w:tc>
+        <w:tc>
+          <w:tcPr>
+            <w:tcW w:type="dxa" w:w="2160"/>
+          </w:tcPr>
+          <w:p>
+            <w:r>
+              <w:t>30.60 req/s</w:t>
+            </w:r>
+          </w:p>
+        </w:tc>
+        <w:tc>
+          <w:tcPr>
+            <w:tcW w:type="dxa" w:w="2160"/>
+          </w:tcPr>
+          <w:p>
+            <w:r>
+              <w:t>0.00%</w:t>
+            </w:r>
+          </w:p>
+        </w:tc>
+      </w:tr>
+      <w:tr>
+        <w:tc>
+          <w:tcPr>
+            <w:tcW w:type="dxa" w:w="2160"/>
+          </w:tcPr>
+          <w:p>
+            <w:r>
+              <w:t>150 VU - Lokal (Laptop)</w:t>
+            </w:r>
+          </w:p>
+        </w:tc>
+        <w:tc>
+          <w:tcPr>
+            <w:tcW w:type="dxa" w:w="2160"/>
+          </w:tcPr>
+          <w:p>
+            <w:r>
+              <w:t>43.94 ms</w:t>
+            </w:r>
+          </w:p>
+        </w:tc>
+        <w:tc>
+          <w:tcPr>
+            <w:tcW w:type="dxa" w:w="2160"/>
+          </w:tcPr>
+          <w:p>
+            <w:r>
+              <w:t>50.15 req/s</w:t>
+            </w:r>
+          </w:p>
+        </w:tc>
+        <w:tc>
+          <w:tcPr>
+            <w:tcW w:type="dxa" w:w="2160"/>
+          </w:tcPr>
+          <w:p>
+            <w:r>
+              <w:t>0.00%</w:t>
+            </w:r>
+          </w:p>
+        </w:tc>
+      </w:tr>
+      <w:tr>
+        <w:tc>
+          <w:tcPr>
+            <w:tcW w:type="dxa" w:w="2160"/>
+          </w:tcPr>
+          <w:p>
+            <w:r>
+              <w:t>150 VU - Produksi (Vercel)</w:t>
+            </w:r>
+          </w:p>
+        </w:tc>
+        <w:tc>
+          <w:tcPr>
+            <w:tcW w:type="dxa" w:w="2160"/>
+          </w:tcPr>
+          <w:p>
+            <w:r>
+              <w:t>591.86 ms</w:t>
+            </w:r>
+          </w:p>
+        </w:tc>
+        <w:tc>
+          <w:tcPr>
+            <w:tcW w:type="dxa" w:w="2160"/>
+          </w:tcPr>
+          <w:p>
+            <w:r>
+              <w:t>40.40 req/s</w:t>
+            </w:r>
+          </w:p>
+        </w:tc>
+        <w:tc>
+          <w:tcPr>
+            <w:tcW w:type="dxa" w:w="2160"/>
+          </w:tcPr>
+          <w:p>
+            <w:r>
+              <w:t>0.00%</w:t>
+            </w:r>
+          </w:p>
+        </w:tc>
+      </w:tr>
+    </w:tbl>
+    <w:p>
+      <w:pPr>
+        <w:pStyle w:val="Heading3"/>
+      </w:pPr>
+      <w:r>
+        <w:t>Analisis Perbandingan Metrik:</w:t>
+      </w:r>
+    </w:p>
+    <w:p>
+      <w:pPr>
+        <w:pStyle w:val="ListBullet"/>
+      </w:pPr>
+      <w:r>
+        <w:rPr>
+          <w:b/>
+        </w:rPr>
+        <w:t xml:space="preserve">1. Perbedaan Latensi (Network Hop &amp; Cold Start): </w:t>
+      </w:r>
+      <w:r>
+        <w:t>Latensi di server lokal sangat cepat (~43 ms) karena ketiadaan hambatan jaringan (zero network hop). Sedangkan pada Vercel (~591 ms), peningkatan latensi terjadi akibat waktu tempuh jaringan internet nyata, proses jabat tangan enkripsi (TLS Handshake), serta fenomena "Cold Start" dari arsitektur Serverless Function Vercel.</w:t>
+      </w:r>
+    </w:p>
+    <w:p>
+      <w:pPr>
+        <w:pStyle w:val="ListBullet"/>
+      </w:pPr>
+      <w:r>
+        <w:rPr>
+          <w:b/>
+        </w:rPr>
+        <w:t xml:space="preserve">2. Throughput (Kapasitas Menelan Request): </w:t>
+      </w:r>
+      <w:r>
+        <w:t>Kapasitas Throughput lokal sedikit lebih unggul (50.15 req/s) dibandingkan produksi (40.40 req/s) pada 150 VU. Ini menunjukkan batas optimal alokasi memori gratis (Hobby tier) Vercel saat menerima hantaman permintaan massal.</w:t>
+      </w:r>
+    </w:p>
+    <w:p>
+      <w:pPr>
+        <w:pStyle w:val="ListBullet"/>
+      </w:pPr>
+      <w:r>
+        <w:rPr>
+          <w:b/>
+        </w:rPr>
+        <w:t xml:space="preserve">3. Stabilitas Kode (Zero Error): </w:t>
+      </w:r>
+      <w:r>
+        <w:t>Fakta bahwa kedua lingkungan (Lokal maupun Produksi) mencatatkan 0.00% kegagalan permintaan (Error) membuktikan bahwa logika kode dan arsitektur database Prisma di aplikasi HYDE sangat tangguh. Perlambatan di produksi murni disebabkan oleh batasan infrastruktur cloud (Network/Hardware limit), bukan karena cacat perangkat lunak (Software bugs).</w:t>
+      </w:r>
+    </w:p>
     <w:sectPr>
       <w:pgSz w:w="12240" w:h="15840"/>
       <w:pgMar w:top="1440" w:right="1800" w:bottom="1440" w:left="1800" w:header="720" w:footer="720" w:gutter="0"/>

</xml_diff>